<commit_message>
docs: actualizar el entregable con las direcciones publicadas y los generadores de figuras
La revision del entregable detecto que los bocetos de interfaz eran anteriores a tres cambios: el menu inferior (Alertas paso a la barra superior y su lugar lo ocupa Cultivos), la tarjeta del modulo vigente con su selector y la accion de registrar la primera medicion en el estado vacio. Se actualizaron los bocetos y se regeneraron las figuras de los dos documentos, verificando por huella digital que las insertadas son las vigentes. Se agregan ademas al repositorio los programas que generan las figuras y llenan el entregable, para que puedan reproducirse. El entregable incorpora las direcciones publicas de la aplicacion y del servicio.
</commit_message>
<xml_diff>
--- a/docs/Santos_Perfil_Proyecto_v1.docx
+++ b/docs/Santos_Perfil_Proyecto_v1.docx
@@ -567,7 +567,7 @@
           <w:p>
             <w:r/>
             <w:r>
-              <w:t>Monitoreo y gestión de las variables fisicoquímicas y ambientales de un módulo de cultivo hidropónico piloto: adquisición, registro, consulta histórica, configuración de rangos de referencia y generación de alertas. Aplicación web y móvil con servicio propio (API REST) y base de datos en la nube. Se aprueban dos roles de usuario —Administrador y Operador—, conforme a la recomendación de la tutoría. Queda fuera de alcance el control automático de actuadores.</w:t>
+              <w:t>Monitoreo y gestión de las variables fisicoquímicas y ambientales de un módulo de cultivo hidropónico piloto: adquisición, registro, consulta histórica, configuración de rangos de referencia y generación de alertas. Catálogo de cultivos con sus rangos de referencia (lechuga, acelga, apio y otras hortalizas), del que cada módulo adopta uno. Aplicación web y móvil con servicio propio (API REST) y base de datos en la nube. Se aprueban dos roles de usuario —Administrador y Operador—, conforme a la recomendación de la tutoría. Queda fuera de alcance el control automático de actuadores.</w:t>
             </w:r>
           </w:p>
         </w:tc>
@@ -652,6 +652,90 @@
             <w:r/>
             <w:r>
               <w:t>https://github.com/saintssud-sud/Proyecto---Diplomado/blob/main/docs/TABLERO.md</w:t>
+            </w:r>
+          </w:p>
+        </w:tc>
+      </w:tr>
+      <w:tr>
+        <w:tblPrEx>
+          <w:tblCellMar>
+            <w:top w:w="0" w:type="dxa"/>
+            <w:bottom w:w="0" w:type="dxa"/>
+          </w:tblCellMar>
+        </w:tblPrEx>
+        <w:tc>
+          <w:tcPr>
+            <w:tcW w:w="3200" w:type="dxa"/>
+            <w:tcMar>
+              <w:top w:w="60" w:type="dxa"/>
+              <w:left w:w="100" w:type="dxa"/>
+              <w:bottom w:w="60" w:type="dxa"/>
+              <w:right w:w="100" w:type="dxa"/>
+            </w:tcMar>
+          </w:tcPr>
+          <w:p>
+            <w:r/>
+            <w:r>
+              <w:t>Dirección pública de la aplicación</w:t>
+            </w:r>
+          </w:p>
+        </w:tc>
+        <w:tc>
+          <w:tcPr>
+            <w:tcW w:w="5600" w:type="dxa"/>
+            <w:tcMar>
+              <w:top w:w="60" w:type="dxa"/>
+              <w:left w:w="100" w:type="dxa"/>
+              <w:bottom w:w="60" w:type="dxa"/>
+              <w:right w:w="100" w:type="dxa"/>
+            </w:tcMar>
+          </w:tcPr>
+          <w:p>
+            <w:r/>
+            <w:r>
+              <w:t>https://sigvach26-bd.web.app</w:t>
+            </w:r>
+          </w:p>
+        </w:tc>
+      </w:tr>
+      <w:tr>
+        <w:tblPrEx>
+          <w:tblCellMar>
+            <w:top w:w="0" w:type="dxa"/>
+            <w:bottom w:w="0" w:type="dxa"/>
+          </w:tblCellMar>
+        </w:tblPrEx>
+        <w:tc>
+          <w:tcPr>
+            <w:tcW w:w="3200" w:type="dxa"/>
+            <w:tcMar>
+              <w:top w:w="60" w:type="dxa"/>
+              <w:left w:w="100" w:type="dxa"/>
+              <w:bottom w:w="60" w:type="dxa"/>
+              <w:right w:w="100" w:type="dxa"/>
+            </w:tcMar>
+          </w:tcPr>
+          <w:p>
+            <w:r/>
+            <w:r>
+              <w:t>Dirección pública del servicio</w:t>
+            </w:r>
+          </w:p>
+        </w:tc>
+        <w:tc>
+          <w:tcPr>
+            <w:tcW w:w="5600" w:type="dxa"/>
+            <w:tcMar>
+              <w:top w:w="60" w:type="dxa"/>
+              <w:left w:w="100" w:type="dxa"/>
+              <w:bottom w:w="60" w:type="dxa"/>
+              <w:right w:w="100" w:type="dxa"/>
+            </w:tcMar>
+          </w:tcPr>
+          <w:p>
+            <w:r/>
+            <w:r>
+              <w:t>https://sigvach-api.onrender.com</w:t>
             </w:r>
           </w:p>
         </w:tc>

</xml_diff>

<commit_message>
docs(e1): precisar el patron arquitectonico y distinguir el servicio del sistema
La redaccion anterior mezclaba tres ideas: el patron de despliegue, la organizacion interna y los componentes del sistema, de modo que un lector atento podia preguntar por que se habla de cuatro niveles si el servicio es un monolito. La redaccion nueva separa el patron de despliegue (monolito modular), la organizacion en capas y los componentes del sistema, y aclara que todo monolito modular es un monolito pero no al reves. Se regenera el PDF.
</commit_message>
<xml_diff>
--- a/docs/Santos_Perfil_Proyecto_v1.docx
+++ b/docs/Santos_Perfil_Proyecto_v1.docx
@@ -6317,7 +6317,7 @@
         <mc:AlternateContent>
           <mc:Choice Requires="wpg">
             <w:drawing>
-              <wp:anchor distT="0" distB="0" distL="114300" distR="114300" simplePos="0" relativeHeight="251663360" behindDoc="1" locked="0" layoutInCell="1" allowOverlap="1" wp14:anchorId="42CEF313" wp14:editId="0E0C296D">
+              <wp:anchor distT="0" distB="0" distL="114300" distR="114300" simplePos="0" relativeHeight="251663360" behindDoc="1" locked="0" layoutInCell="1" allowOverlap="1" wp14:anchorId="42CEF313" wp14:editId="729A4142">
                 <wp:simplePos x="0" y="0"/>
                 <wp:positionH relativeFrom="margin">
                   <wp:posOffset>-79466</wp:posOffset>
@@ -6325,8 +6325,8 @@
                 <wp:positionV relativeFrom="paragraph">
                   <wp:posOffset>438694</wp:posOffset>
                 </wp:positionV>
-                <wp:extent cx="6117772" cy="5312231"/>
-                <wp:effectExtent l="0" t="0" r="0" b="3175"/>
+                <wp:extent cx="6117772" cy="5442607"/>
+                <wp:effectExtent l="0" t="0" r="0" b="5715"/>
                 <wp:wrapNone/>
                 <wp:docPr id="1857305205" name="Grupo 7"/>
                 <wp:cNvGraphicFramePr/>
@@ -6337,9 +6337,9 @@
                       <wpg:grpSpPr>
                         <a:xfrm>
                           <a:off x="0" y="0"/>
-                          <a:ext cx="6117772" cy="5312231"/>
+                          <a:ext cx="6117772" cy="5442607"/>
                           <a:chOff x="-76579" y="0"/>
-                          <a:chExt cx="6148193" cy="4561229"/>
+                          <a:chExt cx="6148193" cy="4673174"/>
                         </a:xfrm>
                       </wpg:grpSpPr>
                       <pic:pic xmlns:pic="http://schemas.openxmlformats.org/drawingml/2006/picture">
@@ -6429,8 +6429,8 @@
                         <wps:cNvSpPr txBox="1"/>
                         <wps:spPr>
                           <a:xfrm>
-                            <a:off x="533399" y="4291354"/>
-                            <a:ext cx="4793615" cy="269875"/>
+                            <a:off x="76570" y="4290182"/>
+                            <a:ext cx="5765307" cy="382992"/>
                           </a:xfrm>
                           <a:prstGeom prst="rect">
                             <a:avLst/>
@@ -6443,9 +6443,6 @@
                         <wps:txbx>
                           <w:txbxContent>
                             <w:p>
-                              <w:pPr>
-                                <w:jc w:val="center"/>
-                              </w:pPr>
                               <w:r>
                                 <w:rPr>
                                   <w:sz w:val="18"/>
@@ -6453,21 +6450,12 @@
                                 </w:rPr>
                                 <w:t xml:space="preserve">El Administrador configura el sistema; el Operador registra las mediciones, atiende las alertas y </w:t>
                               </w:r>
-                              <w:proofErr w:type="spellStart"/>
                               <w:r>
                                 <w:rPr>
                                   <w:sz w:val="18"/>
                                   <w:szCs w:val="18"/>
                                 </w:rPr>
-                                <w:t>cobsulta</w:t>
-                              </w:r>
-                              <w:proofErr w:type="spellEnd"/>
-                              <w:r>
-                                <w:rPr>
-                                  <w:sz w:val="18"/>
-                                  <w:szCs w:val="18"/>
-                                </w:rPr>
-                                <w:t>.</w:t>
+                                <w:t>consulta el panel y el historial.</w:t>
                               </w:r>
                             </w:p>
                           </w:txbxContent>
@@ -6493,7 +6481,7 @@
           </mc:Choice>
           <mc:Fallback>
             <w:pict>
-              <v:group w14:anchorId="42CEF313" id="Grupo 7" o:spid="_x0000_s1026" style="position:absolute;margin-left:-6.25pt;margin-top:34.55pt;width:481.7pt;height:418.3pt;z-index:-251653120;mso-position-horizontal-relative:margin;mso-width-relative:margin;mso-height-relative:margin" coordorigin="-765" coordsize="61481,45612" o:gfxdata="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">
+              <v:group w14:anchorId="42CEF313" id="Grupo 7" o:spid="_x0000_s1026" style="position:absolute;margin-left:-6.25pt;margin-top:34.55pt;width:481.7pt;height:428.55pt;z-index:-251653120;mso-position-horizontal-relative:margin;mso-width-relative:margin;mso-height-relative:margin" coordorigin="-765" coordsize="61481,46731" o:gfxdata="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">
                 <v:shapetype id="_x0000_t75" coordsize="21600,21600" o:spt="75" o:preferrelative="t" path="m@4@5l@4@11@9@11@9@5xe" filled="f" stroked="f">
                   <v:stroke joinstyle="miter"/>
                   <v:formulas>
@@ -6547,13 +6535,10 @@
                     </w:txbxContent>
                   </v:textbox>
                 </v:shape>
-                <v:shape id="Cuadro de texto 1" o:spid="_x0000_s1029" type="#_x0000_t202" style="position:absolute;left:5333;top:42913;width:47937;height:2699;visibility:visible;mso-wrap-style:square;v-text-anchor:top" o:gfxdata="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" filled="f" stroked="f" strokeweight=".5pt">
+                <v:shape id="Cuadro de texto 1" o:spid="_x0000_s1029" type="#_x0000_t202" style="position:absolute;left:765;top:42901;width:57653;height:3830;visibility:visible;mso-wrap-style:square;v-text-anchor:top" o:gfxdata="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" filled="f" stroked="f" strokeweight=".5pt">
                   <v:textbox>
                     <w:txbxContent>
                       <w:p>
-                        <w:pPr>
-                          <w:jc w:val="center"/>
-                        </w:pPr>
                         <w:r>
                           <w:rPr>
                             <w:sz w:val="18"/>
@@ -6561,21 +6546,12 @@
                           </w:rPr>
                           <w:t xml:space="preserve">El Administrador configura el sistema; el Operador registra las mediciones, atiende las alertas y </w:t>
                         </w:r>
-                        <w:proofErr w:type="spellStart"/>
                         <w:r>
                           <w:rPr>
                             <w:sz w:val="18"/>
                             <w:szCs w:val="18"/>
                           </w:rPr>
-                          <w:t>cobsulta</w:t>
-                        </w:r>
-                        <w:proofErr w:type="spellEnd"/>
-                        <w:r>
-                          <w:rPr>
-                            <w:sz w:val="18"/>
-                            <w:szCs w:val="18"/>
-                          </w:rPr>
-                          <w:t>.</w:t>
+                          <w:t>consulta el panel y el historial.</w:t>
                         </w:r>
                       </w:p>
                     </w:txbxContent>
@@ -6929,11 +6905,9 @@
         <w:rPr>
           <w:b/>
         </w:rPr>
-        <w:t xml:space="preserve">Patrón arquitectónico adoptado: </w:t>
+        <w:t>Patrón arquitectónico adoptado: monolito modular —variante del patrón monolítico en la que una única unidad desplegable se organiza internamente en módulos con responsabilidad separada— con organización en capas (presentación, lógica de negocio y datos). El servicio constituye esa unidad desplegable: un programa, un proceso y una sola conexión con la base de datos. El sistema en su conjunto es distribuido, con cuatro niveles —adquisición, servicio, datos y presentación—, cuyos componentes (el módulo de adquisición, el servicio, los clientes web y móvil y la base de datos) se comunican por la red.</w:t>
       </w:r>
-      <w:r>
-        <w:t>Monolito modular organizado en cuatro niveles: adquisición, servicio, datos y presentación.</w:t>
-      </w:r>
+      <w:r/>
     </w:p>
     <w:p>
       <w:pPr>
@@ -13988,7 +13962,6 @@
   <w:style w:type="character" w:default="1" w:styleId="Fuentedeprrafopredeter">
     <w:name w:val="Default Paragraph Font"/>
     <w:uiPriority w:val="1"/>
-    <w:semiHidden/>
     <w:unhideWhenUsed/>
   </w:style>
   <w:style w:type="table" w:default="1" w:styleId="Tablanormal">

</xml_diff>

<commit_message>
docs(e1): incorporar la version final del entregable revisada por el autor
La copia depositada en el repositorio se actualizo despues de la ultima confirmacion. Se audito su contenido y contiene todos los cambios de la jornada: el vocabulario del modelado de datos documental, la precision del patron arquitectonico con la distincion entre servicio y sistema, la frase corregida de los casos de uso, las direcciones publicadas y el requisito de disponibilidad. Las cinco figuras insertadas son las vigentes y el documento conserva sus ciento doce parrafos y catorce tablas.
</commit_message>
<xml_diff>
--- a/docs/Santos_Perfil_Proyecto_v1.docx
+++ b/docs/Santos_Perfil_Proyecto_v1.docx
@@ -6905,9 +6905,14 @@
         <w:rPr>
           <w:b/>
         </w:rPr>
-        <w:t>Patrón arquitectónico adoptado: monolito modular —variante del patrón monolítico en la que una única unidad desplegable se organiza internamente en módulos con responsabilidad separada— con organización en capas (presentación, lógica de negocio y datos). El servicio constituye esa unidad desplegable: un programa, un proceso y una sola conexión con la base de datos. El sistema en su conjunto es distribuido, con cuatro niveles —adquisición, servicio, datos y presentación—, cuyos componentes (el módulo de adquisición, el servicio, los clientes web y móvil y la base de datos) se comunican por la red.</w:t>
+        <w:t xml:space="preserve">Patrón arquitectónico adoptado: </w:t>
       </w:r>
-      <w:r/>
+      <w:r>
+        <w:rPr>
+          <w:bCs/>
+        </w:rPr>
+        <w:t>monolito modular variante del patrón monolítico en la que una única unidad desplegable se organiza internamente en módulos con responsabilidad separada con organización en capas (presentación, lógica de negocio y datos). El servicio constituye esa unidad desplegable: un programa, un proceso y una sola conexión con la base de datos. El sistema en su conjunto es distribuido, con cuatro niveles adquisición, servicio, datos y presentación, cuyos componentes (el módulo de adquisición, el servicio, los clientes web y móvil y la base de datos) se comunican por la red.</w:t>
+      </w:r>
     </w:p>
     <w:p>
       <w:pPr>
@@ -13962,6 +13967,7 @@
   <w:style w:type="character" w:default="1" w:styleId="Fuentedeprrafopredeter">
     <w:name w:val="Default Paragraph Font"/>
     <w:uiPriority w:val="1"/>
+    <w:semiHidden/>
     <w:unhideWhenUsed/>
   </w:style>
   <w:style w:type="table" w:default="1" w:styleId="Tablanormal">

</xml_diff>

<commit_message>
docs(e1): corregir la atribucion de citas y completar las fuentes
La afirmacion sobre el seguimiento de las variables de la solucion estaba atribuida a un trabajo de grado que documenta el rendimiento del cultivo, no ese seguimiento: las mediciones se hicieron durante el ensayo pero no quedaron registradas en el informe. Esa afirmacion pasa a sostenerse en la literatura del cultivo sin suelo, y del antecedente institucional se cita lo que efectivamente contiene. El hecho de que las mediciones se hayan hecho y no se hayan conservado se incorpora como evidencia del problema, con su fuente declarada: el informe y la comunicacion personal de su autor. Se agregan ademas la direccion y la fecha de consulta de las fuentes en linea de la tabla de antecedentes, conforme a lo recomendado en la tutoria.
</commit_message>
<xml_diff>
--- a/docs/Santos_Perfil_Proyecto_v1.docx
+++ b/docs/Santos_Perfil_Proyecto_v1.docx
@@ -798,7 +798,7 @@
         <w:jc w:val="both"/>
       </w:pPr>
       <w:r>
-        <w:t>En el ámbito institucional, Tejerina Pinto (2018) y Santos Navarro (2020) evidenciaron que las variables del cultivo requieren seguimiento continuo dentro de rangos de referencia, aunque el registro se realizó de forma manual; Cruz Cerruto (2019) y Baldiviezo Mercado (2019) demostraron la viabilidad técnica de integrar sensores y aplicaciones informáticas en entornos de cultivo, con énfasis en el control antes que en la organización de la información. De ese contraste se delimita el vacío que aborda este trabajo: no existe una solución que integre la adquisición, el registro, la visualización y el seguimiento de las variables de un cultivo hidropónico mediante rangos de referencia por cultivo, disponible para distintos perfiles de usuario y sobre tecnologías accesibles.</w:t>
+        <w:t>En el ámbito institucional, los antecedentes comparan el rendimiento de distintos sistemas hidropónicos (Tejerina Pinto, 2018; Santos Navarro, 2020), mientras que la necesidad de mantener las variables de la solución dentro de rangos de referencia está establecida por la literatura del cultivo sin suelo (Jensen, 1997; Resh, 2013; Urrestarazu, 2004). En el ensayo previo del mismo cultivo las variables se midieron con instrumentos portátiles pero no quedaron registradas en el informe (Santos Navarro, 2020; comunicación personal, 2026), de modo que el análisis se limitó al rendimiento final; Cruz Cerruto (2019) y Baldiviezo Mercado (2019) demostraron la viabilidad técnica de integrar sensores y aplicaciones informáticas en entornos de cultivo, con énfasis en el control antes que en la organización de la información. De ese contraste se delimita el vacío que aborda este trabajo: no existe una solución que integre la adquisición, el registro, la visualización y el seguimiento de las variables de un cultivo hidropónico mediante rangos de referencia por cultivo, disponible para distintos perfiles de usuario y sobre tecnologías accesibles.</w:t>
       </w:r>
     </w:p>
     <w:p>
@@ -1069,7 +1069,7 @@
               <w:spacing w:after="0"/>
             </w:pPr>
             <w:r>
-              <w:t>Bluelab (s. f.)</w:t>
+              <w:t>Bluelab (s. f.). https://bluelab.com · consulta: 13/09/2026</w:t>
             </w:r>
           </w:p>
         </w:tc>
@@ -1171,7 +1171,7 @@
               <w:spacing w:after="0"/>
             </w:pPr>
             <w:r>
-              <w:t>Hanna Instruments (s. f.)</w:t>
+              <w:t>Hanna Instruments (s. f.). https://hannainst.com · consulta: 13/09/2026</w:t>
             </w:r>
           </w:p>
         </w:tc>
@@ -1280,14 +1280,13 @@
               <w:rPr>
                 <w:lang w:val="en-US"/>
               </w:rPr>
-              <w:t>ThinkGrow</w:t>
+              <w:t>ThinkGrow Agricultural Technology (s. f.). https://www.trolmaster.com · consulta: 13/09/2026</w:t>
             </w:r>
             <w:proofErr w:type="spellEnd"/>
             <w:r>
               <w:rPr>
                 <w:lang w:val="en-US"/>
               </w:rPr>
-              <w:t xml:space="preserve"> Agricultural Technology (s. f.)</w:t>
             </w:r>
           </w:p>
         </w:tc>
@@ -1395,7 +1394,7 @@
               <w:spacing w:after="0"/>
             </w:pPr>
             <w:r>
-              <w:t>Gabriel (s. f.)</w:t>
+              <w:t>Gabriel (s. f.). https://github.com/kizniche/Mycodo · consulta: 13/09/2026</w:t>
             </w:r>
           </w:p>
         </w:tc>
@@ -1739,7 +1738,7 @@
               <w:spacing w:after="0"/>
             </w:pPr>
             <w:r>
-              <w:t>En el seguimiento previo del mismo cultivo el registro era manual y la solución se renovaba de forma periódica (Santos Navarro, 2020): sin un aviso automático, la desviación se advierte cuando ya produjo efecto en la planta</w:t>
+              <w:t>En el ensayo previo del mismo cultivo las variables de la solución se midieron con instrumentos portátiles, pero no quedaron registradas en el informe (Santos Navarro, 2020; comunicación personal, 2026): la información medida se perdió y el análisis se limitó al rendimiento final. Sin un registro sistemático, una desviación se advierte solo cuando ya produjo efecto en la planta</w:t>
             </w:r>
           </w:p>
         </w:tc>
@@ -6905,14 +6904,9 @@
         <w:rPr>
           <w:b/>
         </w:rPr>
-        <w:t xml:space="preserve">Patrón arquitectónico adoptado: </w:t>
+        <w:t>Patrón arquitectónico adoptado: monolito modular —variante del patrón monolítico en la que una única unidad desplegable se organiza internamente en módulos con responsabilidad separada— con organización en capas (presentación, lógica de negocio y datos). El servicio constituye esa unidad desplegable: un programa, un proceso y una sola conexión con la base de datos. El sistema en su conjunto es distribuido, con cuatro niveles —adquisición, servicio, datos y presentación—, cuyos componentes (el módulo de adquisición, el servicio, los clientes web y móvil y la base de datos) se comunican por la red.</w:t>
       </w:r>
-      <w:r>
-        <w:rPr>
-          <w:bCs/>
-        </w:rPr>
-        <w:t>monolito modular variante del patrón monolítico en la que una única unidad desplegable se organiza internamente en módulos con responsabilidad separada con organización en capas (presentación, lógica de negocio y datos). El servicio constituye esa unidad desplegable: un programa, un proceso y una sola conexión con la base de datos. El sistema en su conjunto es distribuido, con cuatro niveles adquisición, servicio, datos y presentación, cuyos componentes (el módulo de adquisición, el servicio, los clientes web y móvil y la base de datos) se comunican por la red.</w:t>
-      </w:r>
+      <w:r/>
     </w:p>
     <w:p>
       <w:pPr>
@@ -13967,7 +13961,6 @@
   <w:style w:type="character" w:default="1" w:styleId="Fuentedeprrafopredeter">
     <w:name w:val="Default Paragraph Font"/>
     <w:uiPriority w:val="1"/>
-    <w:semiHidden/>
     <w:unhideWhenUsed/>
   </w:style>
   <w:style w:type="table" w:default="1" w:styleId="Tablanormal">

</xml_diff>

<commit_message>
docs(e1): incorporar los datos reales del ensayo previo en los puntos criticos
La tutoria pidio reemplazar los puntos criticos cualitativos por datos concretos. Los datos provienen del autor del ensayo previo del mismo cultivo y se citan como comunicacion personal, porque no quedaron registrados en su informe: se medía el pH y la conductividad tres veces al dia, todos los dias, durante el periodo de desarrollo, veintiuna mediciones por semana; los valores se usaban en el momento y no se anotaban; la solucion se renovaba al concluir el periodo de desarrollo; y las desviaciones se advertian por su efecto sobre las plantas, que se estresaban o caian. El primer punto critico deja de llamarse esporadico: se mide con frecuencia, pero no se conserva. Se corrigen tambien los parrafos que daban esos datos como provisionales.
</commit_message>
<xml_diff>
--- a/docs/Santos_Perfil_Proyecto_v1.docx
+++ b/docs/Santos_Perfil_Proyecto_v1.docx
@@ -1586,7 +1586,7 @@
               <w:spacing w:after="0"/>
             </w:pPr>
             <w:r>
-              <w:t>Registro manual y esporádico</w:t>
+              <w:t>Registro manual no conservado</w:t>
             </w:r>
           </w:p>
         </w:tc>
@@ -1606,7 +1606,7 @@
               <w:spacing w:after="0"/>
             </w:pPr>
             <w:r>
-              <w:t>Las mediciones se anotan en una libreta o en el teléfono y se transcriben después; no existe un registro único ni un intervalo definido entre mediciones, de modo que el seguimiento depende de la disponibilidad de quien mide</w:t>
+              <w:t>En el ensayo previo del mismo cultivo se medía el pH y la conductividad eléctrica tres veces al día, todos los días, durante el período de desarrollo —veintiuna mediciones por semana—; los valores se usaban en el momento y no se anotaban (comunicación personal, 2026). La solución se renovaba al concluir el período de desarrollo</w:t>
             </w:r>
           </w:p>
         </w:tc>
@@ -1672,7 +1672,7 @@
               <w:spacing w:after="0"/>
             </w:pPr>
             <w:r>
-              <w:t>No queda constancia de quién realizó la medición, con qué instrumento ni en qué condiciones, de modo que no es posible reconstruir la serie de una variable ante una duda</w:t>
+              <w:t>No queda constancia de la serie de una variable: al no registrarse los valores, no es posible comparar el comportamiento entre etapas del cultivo ni saber con qué instrumento se midió (Santos Navarro, 2020; comunicación personal, 2026)</w:t>
             </w:r>
           </w:p>
         </w:tc>
@@ -1738,7 +1738,7 @@
               <w:spacing w:after="0"/>
             </w:pPr>
             <w:r>
-              <w:t>En el ensayo previo del mismo cultivo las variables de la solución se midieron con instrumentos portátiles, pero no quedaron registradas en el informe (Santos Navarro, 2020; comunicación personal, 2026): la información medida se perdió y el análisis se limitó al rendimiento final. Sin un registro sistemático, una desviación se advierte solo cuando ya produjo efecto en la planta</w:t>
+              <w:t>Las desviaciones se advertían por su efecto sobre las plantas: las plántulas se estresaban o caían (comunicación personal, 2026). Es decir, el aviso llegaba cuando el daño ya se había producido, que es precisamente lo que un sistema de alerta temprana evita</w:t>
             </w:r>
           </w:p>
         </w:tc>

</xml_diff>

<commit_message>
docs: verificar los antecedentes contra los documentos originales
La tutoria observo inconsistencias internas entre lo que el trabajo afirma y lo que las fuentes respaldan. Se contrasto cada afirmacion con los dos documentos originales y se corrigio lo que no se sostenia:

- Santos Navarro (2020): el informe si consigna los rangos de referencia y valores puntuales (pH 5,8 y 5,6; -0,1 mS/cm; 26 C) y si enumera los instrumentos; lo que no conserva es la serie de las lecturas. La renovacion documentada es cada 15 dias (2.5.9).

- Tejerina Pinto (2018): confirmadas las variedades, los niveles de oxigenacion, las variables de respuesta y el registro manual.

Se agrega docs/15_VERIFICACION_DE_LOS_ANTECEDENTES, la bitacora de la sesion del 22/09 y el entregable regenerado (39 paginas).
</commit_message>
<xml_diff>
--- a/docs/Santos_Perfil_Proyecto_v1.docx
+++ b/docs/Santos_Perfil_Proyecto_v1.docx
@@ -798,7 +798,7 @@
         <w:jc w:val="both"/>
       </w:pPr>
       <w:r>
-        <w:t>En el ámbito institucional, los antecedentes comparan el rendimiento de distintos sistemas hidropónicos (Tejerina Pinto, 2018; Santos Navarro, 2020), mientras que la necesidad de mantener las variables de la solución dentro de rangos de referencia está establecida por la literatura del cultivo sin suelo (Jensen, 1997; Resh, 2013; Urrestarazu, 2004). En el ensayo previo del mismo cultivo las variables se midieron con instrumentos portátiles pero no quedaron registradas en el informe (Santos Navarro, 2020; comunicación personal, 2026), de modo que el análisis se limitó al rendimiento final; Cruz Cerruto (2019) y Baldiviezo Mercado (2019) demostraron la viabilidad técnica de integrar sensores y aplicaciones informáticas en entornos de cultivo, con énfasis en el control antes que en la organización de la información. De ese contraste se delimita el vacío que aborda este trabajo: no existe una solución que integre la adquisición, el registro, la visualización y el seguimiento de las variables de un cultivo hidropónico mediante rangos de referencia por cultivo, disponible para distintos perfiles de usuario y sobre tecnologías accesibles.</w:t>
+        <w:t>En el ámbito institucional, los antecedentes comparan el rendimiento de distintos sistemas hidropónicos (Tejerina Pinto, 2018; Santos Navarro, 2020), mientras que la necesidad de mantener las variables de la solución dentro de rangos de referencia está establecida por la literatura del cultivo sin suelo (Jensen, 1997; Resh, 2013; Urrestarazu, 2004). En el ensayo previo de espinaca las variables de la solución se midieron con un pHmetro y un conductímetro portátiles y se usaron para corregir la solución en el momento, pero no se conservó la serie de las lecturas (Santos Navarro, 2020; comunicación personal, 2026), de modo que el análisis se limitó a las variables de respuesta del cultivo; Cruz Cerruto (2019) y Baldiviezo Mercado (2019) demostraron la viabilidad técnica de integrar sensores y aplicaciones informáticas en entornos de cultivo, con énfasis en el control antes que en la organización de la información. De ese contraste se delimita el vacío que aborda este trabajo: no existe una solución que integre la adquisición, el registro, la visualización y el seguimiento de las variables de un cultivo hidropónico mediante rangos de referencia por cultivo, disponible para distintos perfiles de usuario y sobre tecnologías accesibles.</w:t>
       </w:r>
     </w:p>
     <w:p>
@@ -1606,7 +1606,7 @@
               <w:spacing w:after="0"/>
             </w:pPr>
             <w:r>
-              <w:t>En el ensayo previo del mismo cultivo se medía el pH y la conductividad eléctrica tres veces al día, todos los días, durante el período de desarrollo —veintiuna mediciones por semana—; los valores se usaban en el momento y no se anotaban (comunicación personal, 2026). La solución se renovaba al concluir el período de desarrollo</w:t>
+              <w:t>En el ensayo previo de espinaca se medía el pH y la conductividad eléctrica tres veces al día, todos los días, durante el período de desarrollo —veintiuna mediciones por semana—; los valores se usaban en el momento para corregir la solución y no se conservó la serie de las mediciones (comunicación personal, 2026). El informe recoge los rangos de referencia y algunos valores puntuales, y la solución se renovaba cada quince días, cuando el pH o la conductividad eléctrica se desviaban (Santos Navarro, 2020)</w:t>
             </w:r>
           </w:p>
         </w:tc>
@@ -1672,7 +1672,7 @@
               <w:spacing w:after="0"/>
             </w:pPr>
             <w:r>
-              <w:t>No queda constancia de la serie de una variable: al no registrarse los valores, no es posible comparar el comportamiento entre etapas del cultivo ni saber con qué instrumento se midió (Santos Navarro, 2020; comunicación personal, 2026)</w:t>
+              <w:t>No queda constancia de la serie de una variable: al no conservarse las mediciones, no es posible comparar el comportamiento entre etapas del cultivo ni reconstruir la secuencia de correcciones aplicadas a la solución (Santos Navarro, 2020; comunicación personal, 2026)</w:t>
             </w:r>
           </w:p>
         </w:tc>

</xml_diff>